<commit_message>
Document set consistency after the reference-implementation retirement
- Maintenance Plan v1.2: handover map no longer lists server/; it now names
  medicore-backend-server/, web/ and docs/ as what a maintainer inherits.
- Technical Debt Ledger v1.4: the deployment note said server/ was excluded from
  deployment; it now records the retirement and where its evidence went.
- Companion references aligned across the set (Testing Report -> Design v1.7,
  User Manual -> Testing Report v1.4, Maintenance Plan -> Ledger v1.4).
- README document list and CLAUDE.md layout updated: the tree is a git repository
  with a GitHub remote, so medicore.bundle is now a redundant snapshot.
</commit_message>
<xml_diff>
--- a/docs/MediCore_HMS_Maintenance_Plan_v1.2.docx
+++ b/docs/MediCore_HMS_Maintenance_Plan_v1.2.docx
@@ -81,7 +81,7 @@
           <w:sz w:val="24"/>
           <w:szCs w:val="24"/>
         </w:rPr>
-        <w:t>Companion documents: Design v1.7 · Testing Report v1.4 · Technical Debt Ledger v1.3</w:t>
+        <w:t>Companion documents: Design v1.7 · Testing Report v1.4 · Technical Debt Ledger v1.4</w:t>
       </w:r>
     </w:p>
     <w:p>
@@ -1984,7 +1984,7 @@
                 <w:sz w:val="20"/>
                 <w:szCs w:val="20"/>
               </w:rPr>
-              <w:t xml:space="preserve">Git repository (M1→deployment-pack commit trail); medicore-backend-server/ is production, server/ is the tested M1 reference, web/ is the front end</w:t>
+              <w:t>Git repository (M1 → deployment-pack commit trail); medicore-backend-server/ is the production backend, web/ is the front end, docs/ carries the delivered documents and browser evidence</w:t>
             </w:r>
           </w:p>
         </w:tc>

</xml_diff>